<commit_message>
modification compte rendu TP2
</commit_message>
<xml_diff>
--- a/TP2/Compteur 2 sec.docx
+++ b/TP2/Compteur 2 sec.docx
@@ -17,7 +17,21 @@
         <w:jc w:val="both"/>
       </w:pPr>
       <w:r>
-        <w:t>Pour déterminer combien de période d’horloge il faut pour un compteur 2s, avec une horloge cadencée à 100 MHz le calcul est le suivant :</w:t>
+        <w:t>Pour déterminer combien de période d’horloge il faut pour un compteur 2s,</w:t>
+      </w:r>
+      <w:r>
+        <w:t xml:space="preserve"> avec une horloge cadencée à 125</w:t>
+      </w:r>
+      <w:r>
+        <w:t xml:space="preserve"> MHz</w:t>
+      </w:r>
+      <w:r>
+        <w:t xml:space="preserve"> (mais pour simplifier les calculs, on la règle à 100 MHz dans le fichier de contrainte)</w:t>
+      </w:r>
+      <w:bookmarkStart w:id="0" w:name="_GoBack"/>
+      <w:bookmarkEnd w:id="0"/>
+      <w:r>
+        <w:t xml:space="preserve"> le calcul est le suivant :</w:t>
       </w:r>
     </w:p>
     <w:p>
@@ -262,6 +276,7 @@
       <w:r>
         <w:rPr>
           <w:noProof/>
+          <w:lang w:eastAsia="fr-FR"/>
         </w:rPr>
         <mc:AlternateContent>
           <mc:Choice Requires="wps">
@@ -376,6 +391,7 @@
       <w:r>
         <w:rPr>
           <w:noProof/>
+          <w:lang w:eastAsia="fr-FR"/>
         </w:rPr>
         <mc:AlternateContent>
           <mc:Choice Requires="wps">
@@ -626,6 +642,7 @@
       <w:r>
         <w:rPr>
           <w:noProof/>
+          <w:lang w:eastAsia="fr-FR"/>
         </w:rPr>
         <mc:AlternateContent>
           <mc:Choice Requires="wps">
@@ -803,6 +820,7 @@
       <w:r>
         <w:rPr>
           <w:noProof/>
+          <w:lang w:eastAsia="fr-FR"/>
         </w:rPr>
         <mc:AlternateContent>
           <mc:Choice Requires="wps">
@@ -1398,6 +1416,7 @@
       <w:r>
         <w:rPr>
           <w:noProof/>
+          <w:lang w:eastAsia="fr-FR"/>
         </w:rPr>
         <mc:AlternateContent>
           <mc:Choice Requires="wps">
@@ -1553,6 +1572,10 @@
     </w:p>
     <w:p>
       <w:r>
+        <w:rPr>
+          <w:noProof/>
+          <w:lang w:eastAsia="fr-FR"/>
+        </w:rPr>
         <mc:AlternateContent>
           <mc:Choice Requires="wps">
             <w:drawing>
@@ -1618,6 +1641,10 @@
         </mc:AlternateContent>
       </w:r>
       <w:r>
+        <w:rPr>
+          <w:noProof/>
+          <w:lang w:eastAsia="fr-FR"/>
+        </w:rPr>
         <mc:AlternateContent>
           <mc:Choice Requires="wps">
             <w:drawing>
@@ -1883,6 +1910,7 @@
       <w:r>
         <w:rPr>
           <w:noProof/>
+          <w:lang w:eastAsia="fr-FR"/>
         </w:rPr>
         <mc:AlternateContent>
           <mc:Choice Requires="wps">
@@ -2131,6 +2159,7 @@
       <w:r>
         <w:rPr>
           <w:noProof/>
+          <w:lang w:eastAsia="fr-FR"/>
         </w:rPr>
         <mc:AlternateContent>
           <mc:Choice Requires="wps">
@@ -2188,21 +2217,7 @@
                                 <w:sz w:val="16"/>
                                 <w:szCs w:val="16"/>
                               </w:rPr>
-                              <w:t>max</w:t>
-                            </w:r>
-                            <w:r>
-                              <w:rPr>
-                                <w:sz w:val="16"/>
-                                <w:szCs w:val="16"/>
-                              </w:rPr>
-                              <w:t>_</w:t>
-                            </w:r>
-                            <w:r>
-                              <w:rPr>
-                                <w:sz w:val="16"/>
-                                <w:szCs w:val="16"/>
-                              </w:rPr>
-                              <w:t>count</w:t>
+                              <w:t>max_count</w:t>
                             </w:r>
                             <w:proofErr w:type="spellEnd"/>
                             <w:proofErr w:type="gramEnd"/>
@@ -2341,6 +2356,7 @@
       <w:r>
         <w:rPr>
           <w:noProof/>
+          <w:lang w:eastAsia="fr-FR"/>
         </w:rPr>
         <mc:AlternateContent>
           <mc:Choice Requires="wps">
@@ -2751,6 +2767,10 @@
         <w:keepNext/>
       </w:pPr>
       <w:r>
+        <w:rPr>
+          <w:noProof/>
+          <w:lang w:eastAsia="fr-FR"/>
+        </w:rPr>
         <w:drawing>
           <wp:inline distT="0" distB="0" distL="0" distR="0" wp14:anchorId="2A88BCBF" wp14:editId="00A92C2C">
             <wp:extent cx="5760720" cy="1515745"/>
@@ -2860,28 +2880,7 @@
         <w:jc w:val="both"/>
       </w:pPr>
       <w:r>
-        <w:t>Pour que le design soit valide, il faut qu’</w:t>
-      </w:r>
-      <w:r>
-        <w:t xml:space="preserve">une fois </w:t>
-      </w:r>
-      <w:r>
-        <w:t xml:space="preserve">la valeur max </w:t>
-      </w:r>
-      <w:r>
-        <w:t>(</w:t>
-      </w:r>
-      <w:r>
-        <w:t>ici 20</w:t>
-      </w:r>
-      <w:r>
-        <w:t xml:space="preserve"> fronts montant d’horloge, donc au bout de 195</w:t>
-      </w:r>
-      <w:r>
-        <w:t xml:space="preserve"> ns)</w:t>
-      </w:r>
-      <w:r>
-        <w:t xml:space="preserve"> atteinte, la sortie </w:t>
+        <w:t xml:space="preserve">Pour que le design soit valide, il faut qu’une fois la valeur max (ici 20 fronts montant d’horloge, donc au bout de 195 ns) atteinte, la sortie </w:t>
       </w:r>
       <w:proofErr w:type="spellStart"/>
       <w:r>
@@ -2908,6 +2907,7 @@
       <w:r>
         <w:rPr>
           <w:noProof/>
+          <w:lang w:eastAsia="fr-FR"/>
         </w:rPr>
         <w:lastRenderedPageBreak/>
         <mc:AlternateContent>
@@ -2959,24 +2959,14 @@
                             <w:r>
                               <w:t xml:space="preserve">Figure </w:t>
                             </w:r>
-                            <w:r>
-                              <w:fldChar w:fldCharType="begin"/>
-                            </w:r>
-                            <w:r>
-                              <w:instrText xml:space="preserve"> SEQ Figure \* ARABIC </w:instrText>
-                            </w:r>
-                            <w:r>
-                              <w:fldChar w:fldCharType="separate"/>
-                            </w:r>
-                            <w:r>
-                              <w:rPr>
-                                <w:noProof/>
-                              </w:rPr>
-                              <w:t>3</w:t>
-                            </w:r>
-                            <w:r>
-                              <w:fldChar w:fldCharType="end"/>
-                            </w:r>
+                            <w:fldSimple w:instr=" SEQ Figure \* ARABIC ">
+                              <w:r>
+                                <w:rPr>
+                                  <w:noProof/>
+                                </w:rPr>
+                                <w:t>3</w:t>
+                              </w:r>
+                            </w:fldSimple>
                             <w:r>
                               <w:t xml:space="preserve"> </w:t>
                             </w:r>
@@ -3138,6 +3128,7 @@
       <w:r>
         <w:rPr>
           <w:noProof/>
+          <w:lang w:eastAsia="fr-FR"/>
         </w:rPr>
         <mc:AlternateContent>
           <mc:Choice Requires="wps">
@@ -3721,6 +3712,7 @@
       <w:r>
         <w:rPr>
           <w:noProof/>
+          <w:lang w:eastAsia="fr-FR"/>
         </w:rPr>
         <mc:AlternateContent>
           <mc:Choice Requires="wps">
@@ -3876,6 +3868,10 @@
     </w:p>
     <w:p>
       <w:r>
+        <w:rPr>
+          <w:noProof/>
+          <w:lang w:eastAsia="fr-FR"/>
+        </w:rPr>
         <mc:AlternateContent>
           <mc:Choice Requires="wps">
             <w:drawing>
@@ -3941,6 +3937,10 @@
         </mc:AlternateContent>
       </w:r>
       <w:r>
+        <w:rPr>
+          <w:noProof/>
+          <w:lang w:eastAsia="fr-FR"/>
+        </w:rPr>
         <mc:AlternateContent>
           <mc:Choice Requires="wps">
             <w:drawing>
@@ -4195,6 +4195,7 @@
       <w:r>
         <w:rPr>
           <w:noProof/>
+          <w:lang w:eastAsia="fr-FR"/>
         </w:rPr>
         <mc:AlternateContent>
           <mc:Choice Requires="wps">
@@ -4441,6 +4442,10 @@
     </w:p>
     <w:p>
       <w:r>
+        <w:rPr>
+          <w:noProof/>
+          <w:lang w:eastAsia="fr-FR"/>
+        </w:rPr>
         <mc:AlternateContent>
           <mc:Choice Requires="wps">
             <w:drawing>
@@ -4554,6 +4559,7 @@
       <w:r>
         <w:rPr>
           <w:noProof/>
+          <w:lang w:eastAsia="fr-FR"/>
         </w:rPr>
         <mc:AlternateContent>
           <mc:Choice Requires="wps">
@@ -4736,6 +4742,7 @@
       <w:r>
         <w:rPr>
           <w:noProof/>
+          <w:lang w:eastAsia="fr-FR"/>
         </w:rPr>
         <mc:AlternateContent>
           <mc:Choice Requires="wps">
@@ -4999,6 +5006,10 @@
     </w:p>
     <w:p>
       <w:r>
+        <w:rPr>
+          <w:noProof/>
+          <w:lang w:eastAsia="fr-FR"/>
+        </w:rPr>
         <mc:AlternateContent>
           <mc:Choice Requires="wps">
             <w:drawing>
@@ -5065,6 +5076,10 @@
     </w:p>
     <w:p>
       <w:r>
+        <w:rPr>
+          <w:noProof/>
+          <w:lang w:eastAsia="fr-FR"/>
+        </w:rPr>
         <mc:AlternateContent>
           <mc:Choice Requires="wps">
             <w:drawing>
@@ -5176,6 +5191,10 @@
         </mc:AlternateContent>
       </w:r>
       <w:r>
+        <w:rPr>
+          <w:noProof/>
+          <w:lang w:eastAsia="fr-FR"/>
+        </w:rPr>
         <mc:AlternateContent>
           <mc:Choice Requires="wps">
             <w:drawing>
@@ -5253,6 +5272,10 @@
         </mc:AlternateContent>
       </w:r>
       <w:r>
+        <w:rPr>
+          <w:noProof/>
+          <w:lang w:eastAsia="fr-FR"/>
+        </w:rPr>
         <mc:AlternateContent>
           <mc:Choice Requires="wps">
             <w:drawing>
@@ -5366,6 +5389,10 @@
         <w:keepNext/>
       </w:pPr>
       <w:r>
+        <w:rPr>
+          <w:noProof/>
+          <w:lang w:eastAsia="fr-FR"/>
+        </w:rPr>
         <w:drawing>
           <wp:inline distT="0" distB="0" distL="0" distR="0" wp14:anchorId="64327321" wp14:editId="0EAEDF20">
             <wp:extent cx="5760720" cy="1410970"/>
@@ -5411,24 +5438,14 @@
       <w:r>
         <w:t xml:space="preserve">Figure </w:t>
       </w:r>
-      <w:r>
-        <w:fldChar w:fldCharType="begin"/>
-      </w:r>
-      <w:r>
-        <w:instrText xml:space="preserve"> SEQ Figure \* ARABIC </w:instrText>
-      </w:r>
-      <w:r>
-        <w:fldChar w:fldCharType="separate"/>
-      </w:r>
-      <w:r>
-        <w:rPr>
-          <w:noProof/>
-        </w:rPr>
-        <w:t>4</w:t>
-      </w:r>
-      <w:r>
-        <w:fldChar w:fldCharType="end"/>
-      </w:r>
+      <w:fldSimple w:instr=" SEQ Figure \* ARABIC ">
+        <w:r>
+          <w:rPr>
+            <w:noProof/>
+          </w:rPr>
+          <w:t>4</w:t>
+        </w:r>
+      </w:fldSimple>
       <w:r>
         <w:t xml:space="preserve"> </w:t>
       </w:r>
@@ -5461,6 +5478,10 @@
         <w:keepNext/>
       </w:pPr>
       <w:r>
+        <w:rPr>
+          <w:noProof/>
+          <w:lang w:eastAsia="fr-FR"/>
+        </w:rPr>
         <w:drawing>
           <wp:inline distT="0" distB="0" distL="0" distR="0" wp14:anchorId="23F5B4E0" wp14:editId="786E7F54">
             <wp:extent cx="5760720" cy="1852295"/>
@@ -5506,24 +5527,14 @@
       <w:r>
         <w:t xml:space="preserve">Figure </w:t>
       </w:r>
-      <w:r>
-        <w:fldChar w:fldCharType="begin"/>
-      </w:r>
-      <w:r>
-        <w:instrText xml:space="preserve"> SEQ Figure \* ARABIC </w:instrText>
-      </w:r>
-      <w:r>
-        <w:fldChar w:fldCharType="separate"/>
-      </w:r>
-      <w:r>
-        <w:rPr>
-          <w:noProof/>
-        </w:rPr>
-        <w:t>5</w:t>
-      </w:r>
-      <w:r>
-        <w:fldChar w:fldCharType="end"/>
-      </w:r>
+      <w:fldSimple w:instr=" SEQ Figure \* ARABIC ">
+        <w:r>
+          <w:rPr>
+            <w:noProof/>
+          </w:rPr>
+          <w:t>5</w:t>
+        </w:r>
+      </w:fldSimple>
       <w:r>
         <w:t xml:space="preserve"> </w:t>
       </w:r>
@@ -5673,6 +5684,10 @@
         <w:keepNext/>
       </w:pPr>
       <w:r>
+        <w:rPr>
+          <w:noProof/>
+          <w:lang w:eastAsia="fr-FR"/>
+        </w:rPr>
         <w:lastRenderedPageBreak/>
         <w:drawing>
           <wp:inline distT="0" distB="0" distL="0" distR="0" wp14:anchorId="7D14B85A" wp14:editId="0964DA13">
@@ -5719,24 +5734,14 @@
       <w:r>
         <w:t xml:space="preserve">Figure </w:t>
       </w:r>
-      <w:r>
-        <w:fldChar w:fldCharType="begin"/>
-      </w:r>
-      <w:r>
-        <w:instrText xml:space="preserve"> SEQ Figure \* ARABIC </w:instrText>
-      </w:r>
-      <w:r>
-        <w:fldChar w:fldCharType="separate"/>
-      </w:r>
-      <w:r>
-        <w:rPr>
-          <w:noProof/>
-        </w:rPr>
-        <w:t>6</w:t>
-      </w:r>
-      <w:r>
-        <w:fldChar w:fldCharType="end"/>
-      </w:r>
+      <w:fldSimple w:instr=" SEQ Figure \* ARABIC ">
+        <w:r>
+          <w:rPr>
+            <w:noProof/>
+          </w:rPr>
+          <w:t>6</w:t>
+        </w:r>
+      </w:fldSimple>
       <w:r>
         <w:t xml:space="preserve"> </w:t>
       </w:r>
@@ -5924,6 +5929,10 @@
         <w:keepNext/>
       </w:pPr>
       <w:r>
+        <w:rPr>
+          <w:noProof/>
+          <w:lang w:eastAsia="fr-FR"/>
+        </w:rPr>
         <w:drawing>
           <wp:inline distT="0" distB="0" distL="0" distR="0" wp14:anchorId="454D2EC2" wp14:editId="1B5EF750">
             <wp:extent cx="5760720" cy="624840"/>
@@ -5969,24 +5978,14 @@
       <w:r>
         <w:t xml:space="preserve">Figure </w:t>
       </w:r>
-      <w:r>
-        <w:fldChar w:fldCharType="begin"/>
-      </w:r>
-      <w:r>
-        <w:instrText xml:space="preserve"> SEQ Figure \* ARABIC </w:instrText>
-      </w:r>
-      <w:r>
-        <w:fldChar w:fldCharType="separate"/>
-      </w:r>
-      <w:r>
-        <w:rPr>
-          <w:noProof/>
-        </w:rPr>
-        <w:t>7</w:t>
-      </w:r>
-      <w:r>
-        <w:fldChar w:fldCharType="end"/>
-      </w:r>
+      <w:fldSimple w:instr=" SEQ Figure \* ARABIC ">
+        <w:r>
+          <w:rPr>
+            <w:noProof/>
+          </w:rPr>
+          <w:t>7</w:t>
+        </w:r>
+      </w:fldSimple>
       <w:r>
         <w:t xml:space="preserve"> Rapport de timings</w:t>
       </w:r>
@@ -5996,6 +5995,10 @@
         <w:keepNext/>
       </w:pPr>
       <w:r>
+        <w:rPr>
+          <w:noProof/>
+          <w:lang w:eastAsia="fr-FR"/>
+        </w:rPr>
         <w:drawing>
           <wp:inline distT="0" distB="0" distL="0" distR="0" wp14:anchorId="78F9FB4B" wp14:editId="5A4E9A14">
             <wp:extent cx="5760720" cy="854710"/>
@@ -6041,24 +6044,14 @@
       <w:r>
         <w:t xml:space="preserve">Figure </w:t>
       </w:r>
-      <w:r>
-        <w:fldChar w:fldCharType="begin"/>
-      </w:r>
-      <w:r>
-        <w:instrText xml:space="preserve"> SEQ Figure \* ARABIC </w:instrText>
-      </w:r>
-      <w:r>
-        <w:fldChar w:fldCharType="separate"/>
-      </w:r>
-      <w:r>
-        <w:rPr>
-          <w:noProof/>
-        </w:rPr>
-        <w:t>8</w:t>
-      </w:r>
-      <w:r>
-        <w:fldChar w:fldCharType="end"/>
-      </w:r>
+      <w:fldSimple w:instr=" SEQ Figure \* ARABIC ">
+        <w:r>
+          <w:rPr>
+            <w:noProof/>
+          </w:rPr>
+          <w:t>8</w:t>
+        </w:r>
+      </w:fldSimple>
       <w:r>
         <w:t xml:space="preserve"> Chemin critique</w:t>
       </w:r>
@@ -6085,6 +6078,10 @@
         <w:keepNext/>
       </w:pPr>
       <w:r>
+        <w:rPr>
+          <w:noProof/>
+          <w:lang w:eastAsia="fr-FR"/>
+        </w:rPr>
         <w:lastRenderedPageBreak/>
         <w:drawing>
           <wp:inline distT="0" distB="0" distL="0" distR="0" wp14:anchorId="6DA29AAB" wp14:editId="12E46611">
@@ -6131,24 +6128,14 @@
       <w:r>
         <w:t xml:space="preserve">Figure </w:t>
       </w:r>
-      <w:r>
-        <w:fldChar w:fldCharType="begin"/>
-      </w:r>
-      <w:r>
-        <w:instrText xml:space="preserve"> SEQ Figure \* ARABIC </w:instrText>
-      </w:r>
-      <w:r>
-        <w:fldChar w:fldCharType="separate"/>
-      </w:r>
-      <w:r>
-        <w:rPr>
-          <w:noProof/>
-        </w:rPr>
-        <w:t>9</w:t>
-      </w:r>
-      <w:r>
-        <w:fldChar w:fldCharType="end"/>
-      </w:r>
+      <w:fldSimple w:instr=" SEQ Figure \* ARABIC ">
+        <w:r>
+          <w:rPr>
+            <w:noProof/>
+          </w:rPr>
+          <w:t>9</w:t>
+        </w:r>
+      </w:fldSimple>
       <w:r>
         <w:t xml:space="preserve"> Capture de l'ILA</w:t>
       </w:r>
@@ -6158,7 +6145,6 @@
       <w:pPr>
         <w:jc w:val="both"/>
       </w:pPr>
-      <w:bookmarkStart w:id="0" w:name="_GoBack"/>
       <w:r>
         <w:t xml:space="preserve">Dans la capture de ILA, </w:t>
       </w:r>
@@ -6184,51 +6170,41 @@
         <w:rPr>
           <w:i/>
         </w:rPr>
-        <w:t>rese</w:t>
-      </w:r>
+        <w:t>resetn</w:t>
+      </w:r>
+      <w:proofErr w:type="spellEnd"/>
+      <w:r>
+        <w:t xml:space="preserve"> = 1 sont les conditions de trigger. On observe bien qu’avec un appui de </w:t>
+      </w:r>
+      <w:proofErr w:type="spellStart"/>
       <w:r>
         <w:rPr>
           <w:i/>
         </w:rPr>
-        <w:t>tn</w:t>
+        <w:t>resetn</w:t>
       </w:r>
       <w:proofErr w:type="spellEnd"/>
       <w:r>
-        <w:t xml:space="preserve"> = 1</w:t>
-      </w:r>
-      <w:r>
-        <w:t xml:space="preserve"> sont les conditions de trigger. On observe bien qu’avec un appui de </w:t>
+        <w:t xml:space="preserve">, </w:t>
       </w:r>
       <w:proofErr w:type="spellStart"/>
       <w:r>
         <w:rPr>
           <w:i/>
         </w:rPr>
-        <w:t>resetn</w:t>
+        <w:t>end_counter</w:t>
       </w:r>
       <w:proofErr w:type="spellEnd"/>
       <w:r>
-        <w:t xml:space="preserve">, </w:t>
-      </w:r>
-      <w:proofErr w:type="spellStart"/>
-      <w:r>
         <w:rPr>
           <w:i/>
         </w:rPr>
-        <w:t>end_counter</w:t>
-      </w:r>
-      <w:proofErr w:type="spellEnd"/>
-      <w:r>
-        <w:rPr>
-          <w:i/>
-        </w:rPr>
         <w:t xml:space="preserve"> </w:t>
       </w:r>
       <w:r>
         <w:t>revient à 0.</w:t>
       </w:r>
     </w:p>
-    <w:bookmarkEnd w:id="0"/>
     <w:p/>
     <w:p/>
     <w:p/>
@@ -6661,6 +6637,7 @@
   <w:style w:type="character" w:default="1" w:styleId="Policepardfaut">
     <w:name w:val="Default Paragraph Font"/>
     <w:uiPriority w:val="1"/>
+    <w:semiHidden/>
     <w:unhideWhenUsed/>
   </w:style>
   <w:style w:type="table" w:default="1" w:styleId="TableauNormal">
@@ -7014,7 +6991,7 @@
 </file>
 
 <file path=customXml/itemProps1.xml><?xml version="1.0" encoding="utf-8"?>
-<ds:datastoreItem xmlns:ds="http://schemas.openxmlformats.org/officeDocument/2006/customXml" ds:itemID="{55AC13B7-0948-44B8-96CE-5FD9E3455199}">
+<ds:datastoreItem xmlns:ds="http://schemas.openxmlformats.org/officeDocument/2006/customXml" ds:itemID="{F3B41F8B-6937-4AA8-B6BF-B25E4DD4F2C8}">
   <ds:schemaRefs>
     <ds:schemaRef ds:uri="http://schemas.openxmlformats.org/officeDocument/2006/bibliography"/>
   </ds:schemaRefs>

</xml_diff>

<commit_message>
remise du compte rendu TP3
</commit_message>
<xml_diff>
--- a/TP2/Compteur 2 sec.docx
+++ b/TP2/Compteur 2 sec.docx
@@ -28,8 +28,6 @@
       <w:r>
         <w:t xml:space="preserve"> (mais pour simplifier les calculs, on la règle à 100 MHz dans le fichier de contrainte)</w:t>
       </w:r>
-      <w:bookmarkStart w:id="0" w:name="_GoBack"/>
-      <w:bookmarkEnd w:id="0"/>
       <w:r>
         <w:t xml:space="preserve"> le calcul est le suivant :</w:t>
       </w:r>
@@ -1166,6 +1164,10 @@
             <w:pict>
               <v:group id="Groupe 61" o:spid="_x0000_s1030" style="position:absolute;margin-left:196.9pt;margin-top:19.35pt;width:51.45pt;height:54.5pt;z-index:251666432" coordsize="6530,6924" o:gfxdata="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">
                 <v:rect id="Rectangle 9" o:spid="_x0000_s1031" style="position:absolute;left:809;width:5215;height:6924;visibility:visible;mso-wrap-style:square;v-text-anchor:middle" o:gfxdata="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" filled="f" strokecolor="black [3213]" strokeweight="1pt"/>
+                <v:shapetype id="_x0000_t202" coordsize="21600,21600" o:spt="202" path="m,l,21600r21600,l21600,xe">
+                  <v:stroke joinstyle="miter"/>
+                  <v:path gradientshapeok="t" o:connecttype="rect"/>
+                </v:shapetype>
                 <v:shape id="_x0000_s1032" type="#_x0000_t202" style="position:absolute;width:2413;height:2705;visibility:visible;mso-wrap-style:square;v-text-anchor:top" o:gfxdata="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" filled="f" stroked="f">
                   <v:textbox>
                     <w:txbxContent>
@@ -1815,6 +1817,100 @@
           </mc:Fallback>
         </mc:AlternateContent>
       </w:r>
+      <w:bookmarkStart w:id="0" w:name="_GoBack"/>
+      <w:r>
+        <w:rPr>
+          <w:noProof/>
+          <w:lang w:eastAsia="fr-FR"/>
+        </w:rPr>
+        <mc:AlternateContent>
+          <mc:Choice Requires="wps">
+            <w:drawing>
+              <wp:anchor distT="0" distB="0" distL="114300" distR="114300" simplePos="0" relativeHeight="251742208" behindDoc="0" locked="0" layoutInCell="1" allowOverlap="1" wp14:anchorId="0449AF54" wp14:editId="19D7E469">
+                <wp:simplePos x="0" y="0"/>
+                <wp:positionH relativeFrom="column">
+                  <wp:posOffset>4676140</wp:posOffset>
+                </wp:positionH>
+                <wp:positionV relativeFrom="paragraph">
+                  <wp:posOffset>157480</wp:posOffset>
+                </wp:positionV>
+                <wp:extent cx="361213" cy="186347"/>
+                <wp:effectExtent l="0" t="0" r="39370" b="23495"/>
+                <wp:wrapNone/>
+                <wp:docPr id="5" name="Pentagone 5"/>
+                <wp:cNvGraphicFramePr/>
+                <a:graphic xmlns:a="http://schemas.openxmlformats.org/drawingml/2006/main">
+                  <a:graphicData uri="http://schemas.microsoft.com/office/word/2010/wordprocessingShape">
+                    <wps:wsp>
+                      <wps:cNvSpPr/>
+                      <wps:spPr>
+                        <a:xfrm>
+                          <a:off x="0" y="0"/>
+                          <a:ext cx="361213" cy="186347"/>
+                        </a:xfrm>
+                        <a:prstGeom prst="homePlate">
+                          <a:avLst/>
+                        </a:prstGeom>
+                        <a:noFill/>
+                        <a:ln>
+                          <a:solidFill>
+                            <a:schemeClr val="tx1"/>
+                          </a:solidFill>
+                        </a:ln>
+                      </wps:spPr>
+                      <wps:style>
+                        <a:lnRef idx="2">
+                          <a:schemeClr val="accent1">
+                            <a:shade val="50000"/>
+                          </a:schemeClr>
+                        </a:lnRef>
+                        <a:fillRef idx="1">
+                          <a:schemeClr val="accent1"/>
+                        </a:fillRef>
+                        <a:effectRef idx="0">
+                          <a:schemeClr val="accent1"/>
+                        </a:effectRef>
+                        <a:fontRef idx="minor">
+                          <a:schemeClr val="lt1"/>
+                        </a:fontRef>
+                      </wps:style>
+                      <wps:bodyPr rot="0" spcFirstLastPara="0" vertOverflow="overflow" horzOverflow="overflow" vert="horz" wrap="square" lIns="91440" tIns="45720" rIns="91440" bIns="45720" numCol="1" spcCol="0" rtlCol="0" fromWordArt="0" anchor="ctr" anchorCtr="0" forceAA="0" compatLnSpc="1">
+                        <a:prstTxWarp prst="textNoShape">
+                          <a:avLst/>
+                        </a:prstTxWarp>
+                        <a:noAutofit/>
+                      </wps:bodyPr>
+                    </wps:wsp>
+                  </a:graphicData>
+                </a:graphic>
+                <wp14:sizeRelH relativeFrom="margin">
+                  <wp14:pctWidth>0</wp14:pctWidth>
+                </wp14:sizeRelH>
+                <wp14:sizeRelV relativeFrom="margin">
+                  <wp14:pctHeight>0</wp14:pctHeight>
+                </wp14:sizeRelV>
+              </wp:anchor>
+            </w:drawing>
+          </mc:Choice>
+          <mc:Fallback>
+            <w:pict>
+              <v:shapetype w14:anchorId="77D8BEEE" id="_x0000_t15" coordsize="21600,21600" o:spt="15" adj="16200" path="m@0,l,,,21600@0,21600,21600,10800xe">
+                <v:stroke joinstyle="miter"/>
+                <v:formulas>
+                  <v:f eqn="val #0"/>
+                  <v:f eqn="prod #0 1 2"/>
+                </v:formulas>
+                <v:path gradientshapeok="t" o:connecttype="custom" o:connectlocs="@1,0;0,10800;@1,21600;21600,10800" o:connectangles="270,180,90,0" textboxrect="0,0,10800,21600;0,0,16200,21600;0,0,21600,21600"/>
+                <v:handles>
+                  <v:h position="#0,topLeft" xrange="0,21600"/>
+                </v:handles>
+              </v:shapetype>
+              <v:shape id="Pentagone 5" o:spid="_x0000_s1026" type="#_x0000_t15" style="position:absolute;margin-left:368.2pt;margin-top:12.4pt;width:28.45pt;height:14.65pt;z-index:251742208;visibility:visible;mso-wrap-style:square;mso-width-percent:0;mso-height-percent:0;mso-wrap-distance-left:9pt;mso-wrap-distance-top:0;mso-wrap-distance-right:9pt;mso-wrap-distance-bottom:0;mso-position-horizontal:absolute;mso-position-horizontal-relative:text;mso-position-vertical:absolute;mso-position-vertical-relative:text;mso-width-percent:0;mso-height-percent:0;mso-width-relative:margin;mso-height-relative:margin;v-text-anchor:middle" o:gfxdata="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" adj="16028" filled="f" strokecolor="black [3213]" strokeweight="1pt"/>
+            </w:pict>
+          </mc:Fallback>
+        </mc:AlternateContent>
+      </w:r>
+      <w:bookmarkEnd w:id="0"/>
       <w:r>
         <w:rPr>
           <w:noProof/>
@@ -2959,14 +3055,36 @@
                             <w:r>
                               <w:t xml:space="preserve">Figure </w:t>
                             </w:r>
-                            <w:fldSimple w:instr=" SEQ Figure \* ARABIC ">
-                              <w:r>
-                                <w:rPr>
-                                  <w:noProof/>
-                                </w:rPr>
-                                <w:t>3</w:t>
-                              </w:r>
-                            </w:fldSimple>
+                            <w:r>
+                              <w:rPr>
+                                <w:noProof/>
+                              </w:rPr>
+                              <w:fldChar w:fldCharType="begin"/>
+                            </w:r>
+                            <w:r>
+                              <w:rPr>
+                                <w:noProof/>
+                              </w:rPr>
+                              <w:instrText xml:space="preserve"> SEQ Figure \* ARABIC </w:instrText>
+                            </w:r>
+                            <w:r>
+                              <w:rPr>
+                                <w:noProof/>
+                              </w:rPr>
+                              <w:fldChar w:fldCharType="separate"/>
+                            </w:r>
+                            <w:r>
+                              <w:rPr>
+                                <w:noProof/>
+                              </w:rPr>
+                              <w:t>3</w:t>
+                            </w:r>
+                            <w:r>
+                              <w:rPr>
+                                <w:noProof/>
+                              </w:rPr>
+                              <w:fldChar w:fldCharType="end"/>
+                            </w:r>
                             <w:r>
                               <w:t xml:space="preserve"> </w:t>
                             </w:r>
@@ -5438,14 +5556,36 @@
       <w:r>
         <w:t xml:space="preserve">Figure </w:t>
       </w:r>
-      <w:fldSimple w:instr=" SEQ Figure \* ARABIC ">
-        <w:r>
-          <w:rPr>
-            <w:noProof/>
-          </w:rPr>
-          <w:t>4</w:t>
-        </w:r>
-      </w:fldSimple>
+      <w:r>
+        <w:rPr>
+          <w:noProof/>
+        </w:rPr>
+        <w:fldChar w:fldCharType="begin"/>
+      </w:r>
+      <w:r>
+        <w:rPr>
+          <w:noProof/>
+        </w:rPr>
+        <w:instrText xml:space="preserve"> SEQ Figure \* ARABIC </w:instrText>
+      </w:r>
+      <w:r>
+        <w:rPr>
+          <w:noProof/>
+        </w:rPr>
+        <w:fldChar w:fldCharType="separate"/>
+      </w:r>
+      <w:r>
+        <w:rPr>
+          <w:noProof/>
+        </w:rPr>
+        <w:t>4</w:t>
+      </w:r>
+      <w:r>
+        <w:rPr>
+          <w:noProof/>
+        </w:rPr>
+        <w:fldChar w:fldCharType="end"/>
+      </w:r>
       <w:r>
         <w:t xml:space="preserve"> </w:t>
       </w:r>
@@ -5527,14 +5667,36 @@
       <w:r>
         <w:t xml:space="preserve">Figure </w:t>
       </w:r>
-      <w:fldSimple w:instr=" SEQ Figure \* ARABIC ">
-        <w:r>
-          <w:rPr>
-            <w:noProof/>
-          </w:rPr>
-          <w:t>5</w:t>
-        </w:r>
-      </w:fldSimple>
+      <w:r>
+        <w:rPr>
+          <w:noProof/>
+        </w:rPr>
+        <w:fldChar w:fldCharType="begin"/>
+      </w:r>
+      <w:r>
+        <w:rPr>
+          <w:noProof/>
+        </w:rPr>
+        <w:instrText xml:space="preserve"> SEQ Figure \* ARABIC </w:instrText>
+      </w:r>
+      <w:r>
+        <w:rPr>
+          <w:noProof/>
+        </w:rPr>
+        <w:fldChar w:fldCharType="separate"/>
+      </w:r>
+      <w:r>
+        <w:rPr>
+          <w:noProof/>
+        </w:rPr>
+        <w:t>5</w:t>
+      </w:r>
+      <w:r>
+        <w:rPr>
+          <w:noProof/>
+        </w:rPr>
+        <w:fldChar w:fldCharType="end"/>
+      </w:r>
       <w:r>
         <w:t xml:space="preserve"> </w:t>
       </w:r>
@@ -5734,14 +5896,36 @@
       <w:r>
         <w:t xml:space="preserve">Figure </w:t>
       </w:r>
-      <w:fldSimple w:instr=" SEQ Figure \* ARABIC ">
-        <w:r>
-          <w:rPr>
-            <w:noProof/>
-          </w:rPr>
-          <w:t>6</w:t>
-        </w:r>
-      </w:fldSimple>
+      <w:r>
+        <w:rPr>
+          <w:noProof/>
+        </w:rPr>
+        <w:fldChar w:fldCharType="begin"/>
+      </w:r>
+      <w:r>
+        <w:rPr>
+          <w:noProof/>
+        </w:rPr>
+        <w:instrText xml:space="preserve"> SEQ Figure \* ARABIC </w:instrText>
+      </w:r>
+      <w:r>
+        <w:rPr>
+          <w:noProof/>
+        </w:rPr>
+        <w:fldChar w:fldCharType="separate"/>
+      </w:r>
+      <w:r>
+        <w:rPr>
+          <w:noProof/>
+        </w:rPr>
+        <w:t>6</w:t>
+      </w:r>
+      <w:r>
+        <w:rPr>
+          <w:noProof/>
+        </w:rPr>
+        <w:fldChar w:fldCharType="end"/>
+      </w:r>
       <w:r>
         <w:t xml:space="preserve"> </w:t>
       </w:r>
@@ -5978,14 +6162,36 @@
       <w:r>
         <w:t xml:space="preserve">Figure </w:t>
       </w:r>
-      <w:fldSimple w:instr=" SEQ Figure \* ARABIC ">
-        <w:r>
-          <w:rPr>
-            <w:noProof/>
-          </w:rPr>
-          <w:t>7</w:t>
-        </w:r>
-      </w:fldSimple>
+      <w:r>
+        <w:rPr>
+          <w:noProof/>
+        </w:rPr>
+        <w:fldChar w:fldCharType="begin"/>
+      </w:r>
+      <w:r>
+        <w:rPr>
+          <w:noProof/>
+        </w:rPr>
+        <w:instrText xml:space="preserve"> SEQ Figure \* ARABIC </w:instrText>
+      </w:r>
+      <w:r>
+        <w:rPr>
+          <w:noProof/>
+        </w:rPr>
+        <w:fldChar w:fldCharType="separate"/>
+      </w:r>
+      <w:r>
+        <w:rPr>
+          <w:noProof/>
+        </w:rPr>
+        <w:t>7</w:t>
+      </w:r>
+      <w:r>
+        <w:rPr>
+          <w:noProof/>
+        </w:rPr>
+        <w:fldChar w:fldCharType="end"/>
+      </w:r>
       <w:r>
         <w:t xml:space="preserve"> Rapport de timings</w:t>
       </w:r>
@@ -6044,14 +6250,36 @@
       <w:r>
         <w:t xml:space="preserve">Figure </w:t>
       </w:r>
-      <w:fldSimple w:instr=" SEQ Figure \* ARABIC ">
-        <w:r>
-          <w:rPr>
-            <w:noProof/>
-          </w:rPr>
-          <w:t>8</w:t>
-        </w:r>
-      </w:fldSimple>
+      <w:r>
+        <w:rPr>
+          <w:noProof/>
+        </w:rPr>
+        <w:fldChar w:fldCharType="begin"/>
+      </w:r>
+      <w:r>
+        <w:rPr>
+          <w:noProof/>
+        </w:rPr>
+        <w:instrText xml:space="preserve"> SEQ Figure \* ARABIC </w:instrText>
+      </w:r>
+      <w:r>
+        <w:rPr>
+          <w:noProof/>
+        </w:rPr>
+        <w:fldChar w:fldCharType="separate"/>
+      </w:r>
+      <w:r>
+        <w:rPr>
+          <w:noProof/>
+        </w:rPr>
+        <w:t>8</w:t>
+      </w:r>
+      <w:r>
+        <w:rPr>
+          <w:noProof/>
+        </w:rPr>
+        <w:fldChar w:fldCharType="end"/>
+      </w:r>
       <w:r>
         <w:t xml:space="preserve"> Chemin critique</w:t>
       </w:r>
@@ -6128,14 +6356,36 @@
       <w:r>
         <w:t xml:space="preserve">Figure </w:t>
       </w:r>
-      <w:fldSimple w:instr=" SEQ Figure \* ARABIC ">
-        <w:r>
-          <w:rPr>
-            <w:noProof/>
-          </w:rPr>
-          <w:t>9</w:t>
-        </w:r>
-      </w:fldSimple>
+      <w:r>
+        <w:rPr>
+          <w:noProof/>
+        </w:rPr>
+        <w:fldChar w:fldCharType="begin"/>
+      </w:r>
+      <w:r>
+        <w:rPr>
+          <w:noProof/>
+        </w:rPr>
+        <w:instrText xml:space="preserve"> SEQ Figure \* ARABIC </w:instrText>
+      </w:r>
+      <w:r>
+        <w:rPr>
+          <w:noProof/>
+        </w:rPr>
+        <w:fldChar w:fldCharType="separate"/>
+      </w:r>
+      <w:r>
+        <w:rPr>
+          <w:noProof/>
+        </w:rPr>
+        <w:t>9</w:t>
+      </w:r>
+      <w:r>
+        <w:rPr>
+          <w:noProof/>
+        </w:rPr>
+        <w:fldChar w:fldCharType="end"/>
+      </w:r>
       <w:r>
         <w:t xml:space="preserve"> Capture de l'ILA</w:t>
       </w:r>
@@ -6991,7 +7241,7 @@
 </file>
 
 <file path=customXml/itemProps1.xml><?xml version="1.0" encoding="utf-8"?>
-<ds:datastoreItem xmlns:ds="http://schemas.openxmlformats.org/officeDocument/2006/customXml" ds:itemID="{F3B41F8B-6937-4AA8-B6BF-B25E4DD4F2C8}">
+<ds:datastoreItem xmlns:ds="http://schemas.openxmlformats.org/officeDocument/2006/customXml" ds:itemID="{B3BA6F5D-755F-4EA6-AC21-BFE45E210A4B}">
   <ds:schemaRefs>
     <ds:schemaRef ds:uri="http://schemas.openxmlformats.org/officeDocument/2006/bibliography"/>
   </ds:schemaRefs>

</xml_diff>